<commit_message>
Chapter 5, 6 and 7
</commit_message>
<xml_diff>
--- a/Chapter 6/Chapter 6.docx
+++ b/Chapter 6/Chapter 6.docx
@@ -14,7 +14,6 @@
       </w:pPr>
       <w:r>
         <w:rPr>
-          <w:b/>
           <w:bCs/>
           <w:sz w:val="44"/>
           <w:szCs w:val="44"/>
@@ -32,19 +31,414 @@
       </w:pPr>
       <w:r>
         <w:rPr>
+          <w:bCs/>
+          <w:sz w:val="28"/>
+          <w:szCs w:val="28"/>
+        </w:rPr>
+        <w:t>6.10 (Sales Commissions)</w:t>
+      </w:r>
+      <w:r>
+        <w:rPr>
+          <w:sz w:val="28"/>
+          <w:szCs w:val="28"/>
+        </w:rPr>
+        <w:t xml:space="preserve"> Use a one-dimensional array to solve the following problem: A company pays its salespeople on a commission basis. The salespeople receive $200 per week plus 9% of their gross sales for that week. For example, a salesperson who grosses $5,000 in sales in a week receives $200 plus 9% of $5,000, or a total of $650. Write an application (using an array of counters) that determines how many of the salespeople earned salaries in each of the following ranges (assume that each salesperson’s salary is truncated to an integer amount):</w:t>
+      </w:r>
+    </w:p>
+    <w:p>
+      <w:pPr>
+        <w:ind w:left="720"/>
+        <w:jc w:val="both"/>
+        <w:rPr>
+          <w:sz w:val="28"/>
+          <w:szCs w:val="28"/>
+        </w:rPr>
+      </w:pPr>
+      <w:r>
+        <w:rPr>
+          <w:sz w:val="28"/>
+          <w:szCs w:val="28"/>
+        </w:rPr>
+        <w:t xml:space="preserve"> a) $200–299</w:t>
+      </w:r>
+    </w:p>
+    <w:p>
+      <w:pPr>
+        <w:ind w:left="720"/>
+        <w:jc w:val="both"/>
+        <w:rPr>
+          <w:sz w:val="28"/>
+          <w:szCs w:val="28"/>
+        </w:rPr>
+      </w:pPr>
+      <w:r>
+        <w:rPr>
+          <w:sz w:val="28"/>
+          <w:szCs w:val="28"/>
+        </w:rPr>
+        <w:t xml:space="preserve"> b) $300–399 </w:t>
+      </w:r>
+    </w:p>
+    <w:p>
+      <w:pPr>
+        <w:ind w:left="720"/>
+        <w:jc w:val="both"/>
+        <w:rPr>
+          <w:sz w:val="28"/>
+          <w:szCs w:val="28"/>
+        </w:rPr>
+      </w:pPr>
+      <w:r>
+        <w:rPr>
+          <w:sz w:val="28"/>
+          <w:szCs w:val="28"/>
+        </w:rPr>
+        <w:t xml:space="preserve">c) $400–499 </w:t>
+      </w:r>
+    </w:p>
+    <w:p>
+      <w:pPr>
+        <w:ind w:left="720"/>
+        <w:jc w:val="both"/>
+        <w:rPr>
+          <w:sz w:val="28"/>
+          <w:szCs w:val="28"/>
+        </w:rPr>
+      </w:pPr>
+      <w:r>
+        <w:rPr>
+          <w:sz w:val="28"/>
+          <w:szCs w:val="28"/>
+        </w:rPr>
+        <w:t xml:space="preserve">d) $500–599 </w:t>
+      </w:r>
+    </w:p>
+    <w:p>
+      <w:pPr>
+        <w:ind w:left="720"/>
+        <w:jc w:val="both"/>
+        <w:rPr>
+          <w:sz w:val="28"/>
+          <w:szCs w:val="28"/>
+        </w:rPr>
+      </w:pPr>
+      <w:r>
+        <w:rPr>
+          <w:sz w:val="28"/>
+          <w:szCs w:val="28"/>
+        </w:rPr>
+        <w:t xml:space="preserve">e) $600–699 </w:t>
+      </w:r>
+    </w:p>
+    <w:p>
+      <w:pPr>
+        <w:ind w:left="720"/>
+        <w:jc w:val="both"/>
+        <w:rPr>
+          <w:sz w:val="28"/>
+          <w:szCs w:val="28"/>
+        </w:rPr>
+      </w:pPr>
+      <w:r>
+        <w:rPr>
+          <w:sz w:val="28"/>
+          <w:szCs w:val="28"/>
+        </w:rPr>
+        <w:t>f) $700–799</w:t>
+      </w:r>
+    </w:p>
+    <w:p>
+      <w:pPr>
+        <w:ind w:left="720"/>
+        <w:jc w:val="both"/>
+        <w:rPr>
+          <w:sz w:val="28"/>
+          <w:szCs w:val="28"/>
+        </w:rPr>
+      </w:pPr>
+      <w:r>
+        <w:rPr>
+          <w:sz w:val="28"/>
+          <w:szCs w:val="28"/>
+        </w:rPr>
+        <w:t xml:space="preserve"> g) $800–899 </w:t>
+      </w:r>
+    </w:p>
+    <w:p>
+      <w:pPr>
+        <w:ind w:left="720"/>
+        <w:jc w:val="both"/>
+        <w:rPr>
+          <w:sz w:val="28"/>
+          <w:szCs w:val="28"/>
+        </w:rPr>
+      </w:pPr>
+      <w:r>
+        <w:rPr>
+          <w:sz w:val="28"/>
+          <w:szCs w:val="28"/>
+        </w:rPr>
+        <w:t xml:space="preserve">h) $900–999 </w:t>
+      </w:r>
+    </w:p>
+    <w:p>
+      <w:pPr>
+        <w:ind w:left="720"/>
+        <w:jc w:val="both"/>
+        <w:rPr>
+          <w:sz w:val="28"/>
+          <w:szCs w:val="28"/>
+        </w:rPr>
+      </w:pPr>
+      <w:proofErr w:type="spellStart"/>
+      <w:r>
+        <w:rPr>
+          <w:sz w:val="28"/>
+          <w:szCs w:val="28"/>
+        </w:rPr>
+        <w:t>i</w:t>
+      </w:r>
+      <w:proofErr w:type="spellEnd"/>
+      <w:r>
+        <w:rPr>
+          <w:sz w:val="28"/>
+          <w:szCs w:val="28"/>
+        </w:rPr>
+        <w:t xml:space="preserve">) $1,000 </w:t>
+      </w:r>
+    </w:p>
+    <w:p>
+      <w:pPr>
+        <w:jc w:val="both"/>
+        <w:rPr>
+          <w:sz w:val="28"/>
+          <w:szCs w:val="28"/>
+        </w:rPr>
+      </w:pPr>
+      <w:r>
+        <w:rPr>
+          <w:sz w:val="28"/>
+          <w:szCs w:val="28"/>
+        </w:rPr>
+        <w:t xml:space="preserve">and over Summarize the results in tabular format. </w:t>
+      </w:r>
+    </w:p>
+    <w:p>
+      <w:pPr>
+        <w:jc w:val="both"/>
+        <w:rPr>
+          <w:sz w:val="28"/>
+          <w:szCs w:val="28"/>
+        </w:rPr>
+      </w:pPr>
+    </w:p>
+    <w:p>
+      <w:pPr>
+        <w:jc w:val="both"/>
+        <w:rPr>
+          <w:sz w:val="28"/>
+          <w:szCs w:val="28"/>
+        </w:rPr>
+      </w:pPr>
+      <w:r>
+        <w:rPr>
+          <w:bCs/>
+          <w:sz w:val="28"/>
+          <w:szCs w:val="28"/>
+        </w:rPr>
+        <w:t>6.11</w:t>
+      </w:r>
+      <w:r>
+        <w:rPr>
+          <w:sz w:val="28"/>
+          <w:szCs w:val="28"/>
+        </w:rPr>
+        <w:t xml:space="preserve"> Write statements that perform the following one-dimensional-array operations: </w:t>
+      </w:r>
+    </w:p>
+    <w:p>
+      <w:pPr>
+        <w:ind w:left="720"/>
+        <w:jc w:val="both"/>
+        <w:rPr>
+          <w:sz w:val="28"/>
+          <w:szCs w:val="28"/>
+        </w:rPr>
+      </w:pPr>
+      <w:r>
+        <w:rPr>
+          <w:sz w:val="28"/>
+          <w:szCs w:val="28"/>
+        </w:rPr>
+        <w:t xml:space="preserve">a) Set the 10 elements of integer array counts to zero. </w:t>
+      </w:r>
+    </w:p>
+    <w:p>
+      <w:pPr>
+        <w:ind w:left="720"/>
+        <w:jc w:val="both"/>
+        <w:rPr>
+          <w:sz w:val="28"/>
+          <w:szCs w:val="28"/>
+        </w:rPr>
+      </w:pPr>
+      <w:r>
+        <w:rPr>
+          <w:sz w:val="28"/>
+          <w:szCs w:val="28"/>
+        </w:rPr>
+        <w:t xml:space="preserve">b) Add one to each of the 15 elements of integer array bonus. </w:t>
+      </w:r>
+    </w:p>
+    <w:p>
+      <w:pPr>
+        <w:ind w:left="720"/>
+        <w:jc w:val="both"/>
+        <w:rPr>
+          <w:sz w:val="28"/>
+          <w:szCs w:val="28"/>
+        </w:rPr>
+      </w:pPr>
+      <w:r>
+        <w:rPr>
+          <w:sz w:val="28"/>
+          <w:szCs w:val="28"/>
+        </w:rPr>
+        <w:t xml:space="preserve">c) Display the five values of integer array </w:t>
+      </w:r>
+      <w:proofErr w:type="spellStart"/>
+      <w:r>
+        <w:rPr>
+          <w:sz w:val="28"/>
+          <w:szCs w:val="28"/>
+        </w:rPr>
+        <w:t>bestScores</w:t>
+      </w:r>
+      <w:proofErr w:type="spellEnd"/>
+      <w:r>
+        <w:rPr>
+          <w:sz w:val="28"/>
+          <w:szCs w:val="28"/>
+        </w:rPr>
+        <w:t xml:space="preserve"> in column format. </w:t>
+      </w:r>
+    </w:p>
+    <w:p>
+      <w:pPr>
+        <w:jc w:val="both"/>
+        <w:rPr>
+          <w:sz w:val="28"/>
+          <w:szCs w:val="28"/>
+        </w:rPr>
+      </w:pPr>
+    </w:p>
+    <w:p>
+      <w:pPr>
+        <w:jc w:val="both"/>
+        <w:rPr>
+          <w:sz w:val="28"/>
+          <w:szCs w:val="28"/>
+        </w:rPr>
+      </w:pPr>
+      <w:r>
+        <w:rPr>
+          <w:bCs/>
+          <w:sz w:val="28"/>
+          <w:szCs w:val="28"/>
+        </w:rPr>
+        <w:lastRenderedPageBreak/>
+        <w:t>6.12 (Duplicate Elimination)</w:t>
+      </w:r>
+      <w:r>
+        <w:rPr>
+          <w:sz w:val="28"/>
+          <w:szCs w:val="28"/>
+        </w:rPr>
+        <w:t xml:space="preserve"> Use a one-dimensional array to solve the following problem: Write an application that inputs five numbers, each between 10 and 100, inclusive. As each number</w:t>
+      </w:r>
+      <w:r>
+        <w:rPr>
+          <w:sz w:val="28"/>
+          <w:szCs w:val="28"/>
+        </w:rPr>
+        <w:t xml:space="preserve"> </w:t>
+      </w:r>
+      <w:r>
+        <w:rPr>
+          <w:sz w:val="28"/>
+          <w:szCs w:val="28"/>
+        </w:rPr>
+        <w:t xml:space="preserve">is read, display it only if it’s not a duplicate of a number already read. Provide for the “worst case,” in which all five numbers are different. Use the smallest possible array to solve this problem. Display the complete set of unique values input after the user enters each new value. </w:t>
+      </w:r>
+    </w:p>
+    <w:p>
+      <w:pPr>
+        <w:jc w:val="both"/>
+        <w:rPr>
           <w:b/>
           <w:bCs/>
           <w:sz w:val="28"/>
           <w:szCs w:val="28"/>
         </w:rPr>
-        <w:t>6.10 (Sales Commissions)</w:t>
-      </w:r>
-      <w:r>
-        <w:rPr>
-          <w:sz w:val="28"/>
-          <w:szCs w:val="28"/>
-        </w:rPr>
-        <w:t xml:space="preserve"> Use a one-dimensional array to solve the following problem: A company pays its salespeople on a commission basis. The salespeople receive $200 per week plus 9% of their gross sales for that week. For example, a salesperson who grosses $5,000 in sales in a week receives $200 plus 9% of $5,000, or a total of $650. Write an application (using an array of counters) that determines how many of the salespeople earned salaries in each of the following ranges (assume that each salesperson’s salary is truncated to an integer amount):</w:t>
+      </w:pPr>
+    </w:p>
+    <w:p>
+      <w:pPr>
+        <w:jc w:val="both"/>
+        <w:rPr>
+          <w:sz w:val="28"/>
+          <w:szCs w:val="28"/>
+        </w:rPr>
+      </w:pPr>
+      <w:r>
+        <w:rPr>
+          <w:bCs/>
+          <w:sz w:val="28"/>
+          <w:szCs w:val="28"/>
+        </w:rPr>
+        <w:t>6.13</w:t>
+      </w:r>
+      <w:r>
+        <w:rPr>
+          <w:sz w:val="28"/>
+          <w:szCs w:val="28"/>
+        </w:rPr>
+        <w:t xml:space="preserve"> Label the elements of three-by-five two-dimensional array sales to indicate the order in which they’re set to zero by the following program segment: </w:t>
+      </w:r>
+    </w:p>
+    <w:p>
+      <w:pPr>
+        <w:ind w:firstLine="720"/>
+        <w:jc w:val="both"/>
+        <w:rPr>
+          <w:sz w:val="28"/>
+          <w:szCs w:val="28"/>
+        </w:rPr>
+      </w:pPr>
+      <w:r>
+        <w:rPr>
+          <w:sz w:val="28"/>
+          <w:szCs w:val="28"/>
+        </w:rPr>
+        <w:t xml:space="preserve">for (int row = 0; row &lt; </w:t>
+      </w:r>
+      <w:proofErr w:type="spellStart"/>
+      <w:proofErr w:type="gramStart"/>
+      <w:r>
+        <w:rPr>
+          <w:sz w:val="28"/>
+          <w:szCs w:val="28"/>
+        </w:rPr>
+        <w:t>sales.length</w:t>
+      </w:r>
+      <w:proofErr w:type="spellEnd"/>
+      <w:proofErr w:type="gramEnd"/>
+      <w:r>
+        <w:rPr>
+          <w:sz w:val="28"/>
+          <w:szCs w:val="28"/>
+        </w:rPr>
+        <w:t xml:space="preserve">; row++) </w:t>
       </w:r>
     </w:p>
     <w:p>
@@ -61,578 +455,177 @@
           <w:sz w:val="28"/>
           <w:szCs w:val="28"/>
         </w:rPr>
-        <w:t xml:space="preserve"> a) $200–299</w:t>
-      </w:r>
-    </w:p>
-    <w:p>
-      <w:pPr>
-        <w:ind w:left="720"/>
-        <w:jc w:val="both"/>
-        <w:rPr>
-          <w:sz w:val="28"/>
-          <w:szCs w:val="28"/>
-        </w:rPr>
-      </w:pPr>
-      <w:r>
-        <w:rPr>
-          <w:sz w:val="28"/>
-          <w:szCs w:val="28"/>
-        </w:rPr>
-        <w:t xml:space="preserve"> b) $300–399 </w:t>
-      </w:r>
-    </w:p>
-    <w:p>
-      <w:pPr>
-        <w:ind w:left="720"/>
-        <w:jc w:val="both"/>
-        <w:rPr>
-          <w:sz w:val="28"/>
-          <w:szCs w:val="28"/>
-        </w:rPr>
-      </w:pPr>
-      <w:r>
-        <w:rPr>
-          <w:sz w:val="28"/>
-          <w:szCs w:val="28"/>
-        </w:rPr>
-        <w:t xml:space="preserve">c) $400–499 </w:t>
-      </w:r>
-    </w:p>
-    <w:p>
-      <w:pPr>
-        <w:ind w:left="720"/>
-        <w:jc w:val="both"/>
-        <w:rPr>
-          <w:sz w:val="28"/>
-          <w:szCs w:val="28"/>
-        </w:rPr>
-      </w:pPr>
-      <w:r>
-        <w:rPr>
-          <w:sz w:val="28"/>
-          <w:szCs w:val="28"/>
-        </w:rPr>
-        <w:t xml:space="preserve">d) $500–599 </w:t>
-      </w:r>
-    </w:p>
-    <w:p>
-      <w:pPr>
-        <w:ind w:left="720"/>
-        <w:jc w:val="both"/>
-        <w:rPr>
-          <w:sz w:val="28"/>
-          <w:szCs w:val="28"/>
-        </w:rPr>
-      </w:pPr>
-      <w:r>
-        <w:rPr>
-          <w:sz w:val="28"/>
-          <w:szCs w:val="28"/>
-        </w:rPr>
-        <w:t xml:space="preserve">e) $600–699 </w:t>
-      </w:r>
-    </w:p>
-    <w:p>
-      <w:pPr>
-        <w:ind w:left="720"/>
-        <w:jc w:val="both"/>
-        <w:rPr>
-          <w:sz w:val="28"/>
-          <w:szCs w:val="28"/>
-        </w:rPr>
-      </w:pPr>
-      <w:r>
-        <w:rPr>
-          <w:sz w:val="28"/>
-          <w:szCs w:val="28"/>
-        </w:rPr>
-        <w:t>f) $700–799</w:t>
-      </w:r>
-    </w:p>
-    <w:p>
-      <w:pPr>
-        <w:ind w:left="720"/>
-        <w:jc w:val="both"/>
-        <w:rPr>
-          <w:sz w:val="28"/>
-          <w:szCs w:val="28"/>
-        </w:rPr>
-      </w:pPr>
-      <w:r>
-        <w:rPr>
-          <w:sz w:val="28"/>
-          <w:szCs w:val="28"/>
-        </w:rPr>
-        <w:t xml:space="preserve"> g) $800–899 </w:t>
-      </w:r>
-    </w:p>
-    <w:p>
-      <w:pPr>
-        <w:ind w:left="720"/>
-        <w:jc w:val="both"/>
-        <w:rPr>
-          <w:sz w:val="28"/>
-          <w:szCs w:val="28"/>
-        </w:rPr>
-      </w:pPr>
-      <w:r>
-        <w:rPr>
-          <w:sz w:val="28"/>
-          <w:szCs w:val="28"/>
-        </w:rPr>
-        <w:t xml:space="preserve">h) $900–999 </w:t>
-      </w:r>
-    </w:p>
-    <w:p>
-      <w:pPr>
-        <w:ind w:left="720"/>
-        <w:jc w:val="both"/>
-        <w:rPr>
-          <w:sz w:val="28"/>
-          <w:szCs w:val="28"/>
-        </w:rPr>
-      </w:pPr>
-      <w:proofErr w:type="spellStart"/>
-      <w:r>
-        <w:rPr>
-          <w:sz w:val="28"/>
-          <w:szCs w:val="28"/>
-        </w:rPr>
-        <w:t>i</w:t>
-      </w:r>
-      <w:proofErr w:type="spellEnd"/>
-      <w:r>
-        <w:rPr>
-          <w:sz w:val="28"/>
-          <w:szCs w:val="28"/>
-        </w:rPr>
-        <w:t xml:space="preserve">) $1,000 </w:t>
-      </w:r>
-    </w:p>
-    <w:p>
-      <w:pPr>
-        <w:jc w:val="both"/>
-        <w:rPr>
-          <w:sz w:val="28"/>
-          <w:szCs w:val="28"/>
-        </w:rPr>
-      </w:pPr>
-      <w:r>
-        <w:rPr>
-          <w:sz w:val="28"/>
-          <w:szCs w:val="28"/>
-        </w:rPr>
-        <w:t xml:space="preserve">and over Summarize the results in tabular format. </w:t>
-      </w:r>
-    </w:p>
-    <w:p>
-      <w:pPr>
-        <w:jc w:val="both"/>
-        <w:rPr>
-          <w:sz w:val="28"/>
-          <w:szCs w:val="28"/>
-        </w:rPr>
-      </w:pPr>
-    </w:p>
-    <w:p>
-      <w:pPr>
-        <w:jc w:val="both"/>
-        <w:rPr>
-          <w:sz w:val="28"/>
-          <w:szCs w:val="28"/>
-        </w:rPr>
-      </w:pPr>
-      <w:r>
+        <w:t xml:space="preserve">{ </w:t>
+      </w:r>
+    </w:p>
+    <w:p>
+      <w:pPr>
+        <w:ind w:left="720" w:firstLine="720"/>
+        <w:jc w:val="both"/>
+        <w:rPr>
+          <w:sz w:val="28"/>
+          <w:szCs w:val="28"/>
+        </w:rPr>
+      </w:pPr>
+      <w:r>
+        <w:rPr>
+          <w:sz w:val="28"/>
+          <w:szCs w:val="28"/>
+        </w:rPr>
+        <w:t>for (int col = 0; col &lt; sales[row</w:t>
+      </w:r>
+      <w:proofErr w:type="gramStart"/>
+      <w:r>
+        <w:rPr>
+          <w:sz w:val="28"/>
+          <w:szCs w:val="28"/>
+        </w:rPr>
+        <w:t>].length</w:t>
+      </w:r>
+      <w:proofErr w:type="gramEnd"/>
+      <w:r>
+        <w:rPr>
+          <w:sz w:val="28"/>
+          <w:szCs w:val="28"/>
+        </w:rPr>
+        <w:t xml:space="preserve">; col++) </w:t>
+      </w:r>
+    </w:p>
+    <w:p>
+      <w:pPr>
+        <w:ind w:left="720" w:firstLine="720"/>
+        <w:jc w:val="both"/>
+        <w:rPr>
+          <w:sz w:val="28"/>
+          <w:szCs w:val="28"/>
+        </w:rPr>
+      </w:pPr>
+      <w:r>
+        <w:rPr>
+          <w:sz w:val="28"/>
+          <w:szCs w:val="28"/>
+        </w:rPr>
+        <w:t xml:space="preserve">{ </w:t>
+      </w:r>
+    </w:p>
+    <w:p>
+      <w:pPr>
+        <w:ind w:left="1440" w:firstLine="720"/>
+        <w:jc w:val="both"/>
+        <w:rPr>
+          <w:sz w:val="28"/>
+          <w:szCs w:val="28"/>
+        </w:rPr>
+      </w:pPr>
+      <w:r>
+        <w:rPr>
+          <w:sz w:val="28"/>
+          <w:szCs w:val="28"/>
+        </w:rPr>
+        <w:t xml:space="preserve">sales[row][col] = 0; </w:t>
+      </w:r>
+    </w:p>
+    <w:p>
+      <w:pPr>
+        <w:ind w:left="720" w:firstLine="720"/>
+        <w:jc w:val="both"/>
+        <w:rPr>
+          <w:sz w:val="28"/>
+          <w:szCs w:val="28"/>
+        </w:rPr>
+      </w:pPr>
+      <w:r>
+        <w:rPr>
+          <w:sz w:val="28"/>
+          <w:szCs w:val="28"/>
+        </w:rPr>
+        <w:t xml:space="preserve">} </w:t>
+      </w:r>
+    </w:p>
+    <w:p>
+      <w:pPr>
+        <w:ind w:firstLine="720"/>
+        <w:jc w:val="both"/>
+        <w:rPr>
+          <w:sz w:val="28"/>
+          <w:szCs w:val="28"/>
+        </w:rPr>
+      </w:pPr>
+      <w:r>
+        <w:rPr>
+          <w:sz w:val="28"/>
+          <w:szCs w:val="28"/>
+        </w:rPr>
+        <w:t xml:space="preserve">} </w:t>
+      </w:r>
+    </w:p>
+    <w:p>
+      <w:pPr>
+        <w:jc w:val="both"/>
+        <w:rPr>
+          <w:sz w:val="28"/>
+          <w:szCs w:val="28"/>
+        </w:rPr>
+      </w:pPr>
+    </w:p>
+    <w:p>
+      <w:pPr>
+        <w:jc w:val="both"/>
         <w:rPr>
           <w:b/>
           <w:bCs/>
           <w:sz w:val="28"/>
           <w:szCs w:val="28"/>
         </w:rPr>
-        <w:t>6.11</w:t>
-      </w:r>
-      <w:r>
-        <w:rPr>
-          <w:sz w:val="28"/>
-          <w:szCs w:val="28"/>
-        </w:rPr>
-        <w:t xml:space="preserve"> Write statements that perform the following one-dimensional-array operations: </w:t>
-      </w:r>
-    </w:p>
-    <w:p>
-      <w:pPr>
-        <w:ind w:left="720"/>
-        <w:jc w:val="both"/>
-        <w:rPr>
-          <w:sz w:val="28"/>
-          <w:szCs w:val="28"/>
-        </w:rPr>
-      </w:pPr>
-      <w:r>
-        <w:rPr>
-          <w:sz w:val="28"/>
-          <w:szCs w:val="28"/>
-        </w:rPr>
-        <w:t xml:space="preserve">a) Set the 10 elements of integer array counts to zero. </w:t>
-      </w:r>
-    </w:p>
-    <w:p>
-      <w:pPr>
-        <w:ind w:left="720"/>
-        <w:jc w:val="both"/>
-        <w:rPr>
-          <w:sz w:val="28"/>
-          <w:szCs w:val="28"/>
-        </w:rPr>
-      </w:pPr>
-      <w:r>
-        <w:rPr>
-          <w:sz w:val="28"/>
-          <w:szCs w:val="28"/>
-        </w:rPr>
-        <w:t xml:space="preserve">b) Add one to each of the 15 elements of integer array bonus. </w:t>
-      </w:r>
-    </w:p>
-    <w:p>
-      <w:pPr>
-        <w:ind w:left="720"/>
-        <w:jc w:val="both"/>
-        <w:rPr>
-          <w:sz w:val="28"/>
-          <w:szCs w:val="28"/>
-        </w:rPr>
-      </w:pPr>
-      <w:r>
-        <w:rPr>
-          <w:sz w:val="28"/>
-          <w:szCs w:val="28"/>
-        </w:rPr>
-        <w:t xml:space="preserve">c) Display the five values of integer array </w:t>
-      </w:r>
-      <w:proofErr w:type="spellStart"/>
-      <w:r>
-        <w:rPr>
-          <w:sz w:val="28"/>
-          <w:szCs w:val="28"/>
-        </w:rPr>
-        <w:t>bestScores</w:t>
-      </w:r>
-      <w:proofErr w:type="spellEnd"/>
-      <w:r>
-        <w:rPr>
-          <w:sz w:val="28"/>
-          <w:szCs w:val="28"/>
-        </w:rPr>
-        <w:t xml:space="preserve"> in column format. </w:t>
-      </w:r>
-    </w:p>
-    <w:p>
-      <w:pPr>
-        <w:jc w:val="both"/>
-        <w:rPr>
-          <w:sz w:val="28"/>
-          <w:szCs w:val="28"/>
-        </w:rPr>
-      </w:pPr>
-    </w:p>
-    <w:p>
-      <w:pPr>
-        <w:jc w:val="both"/>
-        <w:rPr>
-          <w:sz w:val="28"/>
-          <w:szCs w:val="28"/>
-        </w:rPr>
-      </w:pPr>
-      <w:r>
-        <w:rPr>
-          <w:b/>
+      </w:pPr>
+    </w:p>
+    <w:p>
+      <w:pPr>
+        <w:jc w:val="both"/>
+        <w:rPr>
+          <w:sz w:val="28"/>
+          <w:szCs w:val="28"/>
+        </w:rPr>
+      </w:pPr>
+      <w:r>
+        <w:rPr>
           <w:bCs/>
           <w:sz w:val="28"/>
           <w:szCs w:val="28"/>
         </w:rPr>
-        <w:lastRenderedPageBreak/>
-        <w:t>6.12 (Duplicate Elimination)</w:t>
-      </w:r>
-      <w:r>
-        <w:rPr>
-          <w:sz w:val="28"/>
-          <w:szCs w:val="28"/>
-        </w:rPr>
-        <w:t xml:space="preserve"> Use a one-dimensional array to solve the following problem: Write an application that inputs five numbers, each between 10 and 100, inclusive. As each number</w:t>
-      </w:r>
-      <w:r>
-        <w:rPr>
-          <w:sz w:val="28"/>
-          <w:szCs w:val="28"/>
-        </w:rPr>
-        <w:t xml:space="preserve"> </w:t>
-      </w:r>
-      <w:r>
-        <w:rPr>
-          <w:sz w:val="28"/>
-          <w:szCs w:val="28"/>
-        </w:rPr>
-        <w:t xml:space="preserve">is read, display it only if it’s not a duplicate of a number already read. Provide for the “worst case,” in which all five numbers are different. Use the smallest possible array to solve this problem. Display the complete set of unique values input after the user enters each new value. </w:t>
-      </w:r>
-    </w:p>
-    <w:p>
-      <w:pPr>
-        <w:jc w:val="both"/>
-        <w:rPr>
-          <w:b/>
+        <w:t>6.14</w:t>
+      </w:r>
+      <w:r>
+        <w:rPr>
+          <w:sz w:val="28"/>
+          <w:szCs w:val="28"/>
+        </w:rPr>
+        <w:t xml:space="preserve"> (Variable-Length Argument List) Write an application that calculates the product of a series of integers that are passed to method product using a variable-length argument list. Test your method with several calls, each with a different number of arguments. </w:t>
+      </w:r>
+    </w:p>
+    <w:p>
+      <w:pPr>
+        <w:jc w:val="both"/>
+        <w:rPr>
+          <w:sz w:val="28"/>
+          <w:szCs w:val="28"/>
+        </w:rPr>
+      </w:pPr>
+    </w:p>
+    <w:p>
+      <w:pPr>
+        <w:jc w:val="both"/>
+        <w:rPr>
+          <w:sz w:val="28"/>
+          <w:szCs w:val="28"/>
+        </w:rPr>
+      </w:pPr>
+      <w:r>
+        <w:rPr>
           <w:bCs/>
           <w:sz w:val="28"/>
           <w:szCs w:val="28"/>
         </w:rPr>
-      </w:pPr>
-    </w:p>
-    <w:p>
-      <w:pPr>
-        <w:jc w:val="both"/>
-        <w:rPr>
-          <w:sz w:val="28"/>
-          <w:szCs w:val="28"/>
-        </w:rPr>
-      </w:pPr>
-      <w:r>
-        <w:rPr>
-          <w:b/>
-          <w:bCs/>
-          <w:sz w:val="28"/>
-          <w:szCs w:val="28"/>
-        </w:rPr>
-        <w:t>6.13</w:t>
-      </w:r>
-      <w:r>
-        <w:rPr>
-          <w:sz w:val="28"/>
-          <w:szCs w:val="28"/>
-        </w:rPr>
-        <w:t xml:space="preserve"> Label the elements of three-by-five two-dimensional array sales to indicate the order in which they’re set to zero by the following program segment: </w:t>
-      </w:r>
-    </w:p>
-    <w:p>
-      <w:pPr>
-        <w:ind w:firstLine="720"/>
-        <w:jc w:val="both"/>
-        <w:rPr>
-          <w:sz w:val="28"/>
-          <w:szCs w:val="28"/>
-        </w:rPr>
-      </w:pPr>
-      <w:r>
-        <w:rPr>
-          <w:sz w:val="28"/>
-          <w:szCs w:val="28"/>
-        </w:rPr>
-        <w:t xml:space="preserve">for (int row = 0; row &lt; </w:t>
-      </w:r>
-      <w:proofErr w:type="spellStart"/>
-      <w:proofErr w:type="gramStart"/>
-      <w:r>
-        <w:rPr>
-          <w:sz w:val="28"/>
-          <w:szCs w:val="28"/>
-        </w:rPr>
-        <w:t>sales.length</w:t>
-      </w:r>
-      <w:proofErr w:type="spellEnd"/>
-      <w:proofErr w:type="gramEnd"/>
-      <w:r>
-        <w:rPr>
-          <w:sz w:val="28"/>
-          <w:szCs w:val="28"/>
-        </w:rPr>
-        <w:t xml:space="preserve">; row++) </w:t>
-      </w:r>
-    </w:p>
-    <w:p>
-      <w:pPr>
-        <w:ind w:left="720"/>
-        <w:jc w:val="both"/>
-        <w:rPr>
-          <w:sz w:val="28"/>
-          <w:szCs w:val="28"/>
-        </w:rPr>
-      </w:pPr>
-      <w:r>
-        <w:rPr>
-          <w:sz w:val="28"/>
-          <w:szCs w:val="28"/>
-        </w:rPr>
-        <w:t xml:space="preserve">{ </w:t>
-      </w:r>
-    </w:p>
-    <w:p>
-      <w:pPr>
-        <w:ind w:left="720" w:firstLine="720"/>
-        <w:jc w:val="both"/>
-        <w:rPr>
-          <w:sz w:val="28"/>
-          <w:szCs w:val="28"/>
-        </w:rPr>
-      </w:pPr>
-      <w:r>
-        <w:rPr>
-          <w:sz w:val="28"/>
-          <w:szCs w:val="28"/>
-        </w:rPr>
-        <w:t>for (int col = 0; col &lt; sales[row</w:t>
-      </w:r>
-      <w:proofErr w:type="gramStart"/>
-      <w:r>
-        <w:rPr>
-          <w:sz w:val="28"/>
-          <w:szCs w:val="28"/>
-        </w:rPr>
-        <w:t>].length</w:t>
-      </w:r>
-      <w:proofErr w:type="gramEnd"/>
-      <w:r>
-        <w:rPr>
-          <w:sz w:val="28"/>
-          <w:szCs w:val="28"/>
-        </w:rPr>
-        <w:t xml:space="preserve">; col++) </w:t>
-      </w:r>
-    </w:p>
-    <w:p>
-      <w:pPr>
-        <w:ind w:left="720" w:firstLine="720"/>
-        <w:jc w:val="both"/>
-        <w:rPr>
-          <w:sz w:val="28"/>
-          <w:szCs w:val="28"/>
-        </w:rPr>
-      </w:pPr>
-      <w:r>
-        <w:rPr>
-          <w:sz w:val="28"/>
-          <w:szCs w:val="28"/>
-        </w:rPr>
-        <w:t xml:space="preserve">{ </w:t>
-      </w:r>
-    </w:p>
-    <w:p>
-      <w:pPr>
-        <w:ind w:left="1440" w:firstLine="720"/>
-        <w:jc w:val="both"/>
-        <w:rPr>
-          <w:sz w:val="28"/>
-          <w:szCs w:val="28"/>
-        </w:rPr>
-      </w:pPr>
-      <w:r>
-        <w:rPr>
-          <w:sz w:val="28"/>
-          <w:szCs w:val="28"/>
-        </w:rPr>
-        <w:t xml:space="preserve">sales[row][col] = 0; </w:t>
-      </w:r>
-    </w:p>
-    <w:p>
-      <w:pPr>
-        <w:ind w:left="720" w:firstLine="720"/>
-        <w:jc w:val="both"/>
-        <w:rPr>
-          <w:sz w:val="28"/>
-          <w:szCs w:val="28"/>
-        </w:rPr>
-      </w:pPr>
-      <w:r>
-        <w:rPr>
-          <w:sz w:val="28"/>
-          <w:szCs w:val="28"/>
-        </w:rPr>
-        <w:t xml:space="preserve">} </w:t>
-      </w:r>
-    </w:p>
-    <w:p>
-      <w:pPr>
-        <w:ind w:firstLine="720"/>
-        <w:jc w:val="both"/>
-        <w:rPr>
-          <w:sz w:val="28"/>
-          <w:szCs w:val="28"/>
-        </w:rPr>
-      </w:pPr>
-      <w:r>
-        <w:rPr>
-          <w:sz w:val="28"/>
-          <w:szCs w:val="28"/>
-        </w:rPr>
-        <w:t xml:space="preserve">} </w:t>
-      </w:r>
-    </w:p>
-    <w:p>
-      <w:pPr>
-        <w:jc w:val="both"/>
-        <w:rPr>
-          <w:sz w:val="28"/>
-          <w:szCs w:val="28"/>
-        </w:rPr>
-      </w:pPr>
-    </w:p>
-    <w:p>
-      <w:pPr>
-        <w:jc w:val="both"/>
-        <w:rPr>
-          <w:b/>
-          <w:bCs/>
-          <w:sz w:val="28"/>
-          <w:szCs w:val="28"/>
-        </w:rPr>
-      </w:pPr>
-    </w:p>
-    <w:p>
-      <w:pPr>
-        <w:jc w:val="both"/>
-        <w:rPr>
-          <w:sz w:val="28"/>
-          <w:szCs w:val="28"/>
-        </w:rPr>
-      </w:pPr>
-      <w:r>
-        <w:rPr>
-          <w:b/>
-          <w:bCs/>
-          <w:sz w:val="28"/>
-          <w:szCs w:val="28"/>
-        </w:rPr>
-        <w:t>6.14</w:t>
-      </w:r>
-      <w:r>
-        <w:rPr>
-          <w:sz w:val="28"/>
-          <w:szCs w:val="28"/>
-        </w:rPr>
-        <w:t xml:space="preserve"> (Variable-Length Argument List) Write an application that calculates the product of a series of integers that are passed to method product using a variable-length argument list. Test your method with several calls, each with a different number of arguments. </w:t>
-      </w:r>
-    </w:p>
-    <w:p>
-      <w:pPr>
-        <w:jc w:val="both"/>
-        <w:rPr>
-          <w:sz w:val="28"/>
-          <w:szCs w:val="28"/>
-        </w:rPr>
-      </w:pPr>
-    </w:p>
-    <w:p>
-      <w:pPr>
-        <w:jc w:val="both"/>
-        <w:rPr>
-          <w:sz w:val="28"/>
-          <w:szCs w:val="28"/>
-        </w:rPr>
-      </w:pPr>
-      <w:r>
-        <w:rPr>
-          <w:b/>
-          <w:bCs/>
-          <w:sz w:val="28"/>
-          <w:szCs w:val="28"/>
-        </w:rPr>
         <w:t>6.15</w:t>
       </w:r>
       <w:r>
@@ -662,7 +655,6 @@
       </w:pPr>
       <w:r>
         <w:rPr>
-          <w:b/>
           <w:bCs/>
           <w:sz w:val="28"/>
           <w:szCs w:val="28"/>
@@ -713,7 +705,6 @@
       </w:pPr>
       <w:r>
         <w:rPr>
-          <w:b/>
           <w:bCs/>
           <w:sz w:val="28"/>
           <w:szCs w:val="28"/>
@@ -832,7 +823,6 @@
       </w:pPr>
       <w:r>
         <w:rPr>
-          <w:b/>
           <w:bCs/>
           <w:sz w:val="28"/>
           <w:szCs w:val="28"/>
@@ -841,7 +831,6 @@
       </w:r>
       <w:r>
         <w:rPr>
-          <w:b/>
           <w:bCs/>
           <w:sz w:val="28"/>
           <w:szCs w:val="28"/>
@@ -850,7 +839,6 @@
       </w:r>
       <w:r>
         <w:rPr>
-          <w:b/>
           <w:bCs/>
           <w:sz w:val="28"/>
           <w:szCs w:val="28"/>
@@ -968,7 +956,6 @@
       </w:pPr>
       <w:r>
         <w:rPr>
-          <w:b/>
           <w:bCs/>
           <w:sz w:val="28"/>
           <w:szCs w:val="28"/>
@@ -977,7 +964,6 @@
       </w:r>
       <w:r>
         <w:rPr>
-          <w:b/>
           <w:bCs/>
           <w:sz w:val="28"/>
           <w:szCs w:val="28"/>
@@ -986,7 +972,6 @@
       </w:r>
       <w:r>
         <w:rPr>
-          <w:b/>
           <w:bCs/>
           <w:sz w:val="28"/>
           <w:szCs w:val="28"/>
@@ -1124,7 +1109,6 @@
       </w:pPr>
       <w:r>
         <w:rPr>
-          <w:b/>
           <w:bCs/>
           <w:sz w:val="28"/>
           <w:szCs w:val="28"/>
@@ -1133,7 +1117,6 @@
       </w:r>
       <w:r>
         <w:rPr>
-          <w:b/>
           <w:bCs/>
           <w:sz w:val="28"/>
           <w:szCs w:val="28"/>
@@ -1142,7 +1125,6 @@
       </w:r>
       <w:r>
         <w:rPr>
-          <w:b/>
           <w:bCs/>
           <w:sz w:val="28"/>
           <w:szCs w:val="28"/>
@@ -1478,7 +1460,6 @@
       </w:pPr>
       <w:r>
         <w:rPr>
-          <w:b/>
           <w:bCs/>
           <w:sz w:val="28"/>
           <w:szCs w:val="28"/>
@@ -1487,7 +1468,6 @@
       </w:r>
       <w:r>
         <w:rPr>
-          <w:b/>
           <w:bCs/>
           <w:sz w:val="28"/>
           <w:szCs w:val="28"/>
@@ -1496,7 +1476,6 @@
       </w:r>
       <w:r>
         <w:rPr>
-          <w:b/>
           <w:bCs/>
           <w:sz w:val="28"/>
           <w:szCs w:val="28"/>
@@ -2746,7 +2725,6 @@
       </w:pPr>
       <w:r>
         <w:rPr>
-          <w:b/>
           <w:bCs/>
           <w:sz w:val="28"/>
           <w:szCs w:val="28"/>
@@ -2755,7 +2733,6 @@
       </w:r>
       <w:r>
         <w:rPr>
-          <w:b/>
           <w:bCs/>
           <w:sz w:val="28"/>
           <w:szCs w:val="28"/>
@@ -2764,7 +2741,6 @@
       </w:r>
       <w:r>
         <w:rPr>
-          <w:b/>
           <w:bCs/>
           <w:sz w:val="28"/>
           <w:szCs w:val="28"/>
@@ -2936,7 +2912,6 @@
       </w:pPr>
       <w:r>
         <w:rPr>
-          <w:b/>
           <w:bCs/>
           <w:sz w:val="28"/>
           <w:szCs w:val="28"/>
@@ -3177,7 +3152,6 @@
       </w:pPr>
       <w:r>
         <w:rPr>
-          <w:b/>
           <w:bCs/>
           <w:sz w:val="28"/>
           <w:szCs w:val="28"/>
@@ -3220,7 +3194,6 @@
       </w:pPr>
       <w:r>
         <w:rPr>
-          <w:b/>
           <w:bCs/>
           <w:sz w:val="28"/>
           <w:szCs w:val="28"/>
@@ -3326,7 +3299,6 @@
       </w:pPr>
       <w:r>
         <w:rPr>
-          <w:b/>
           <w:bCs/>
           <w:sz w:val="28"/>
           <w:szCs w:val="28"/>
@@ -3759,7 +3731,6 @@
       </w:pPr>
       <w:r>
         <w:rPr>
-          <w:b/>
           <w:bCs/>
           <w:sz w:val="28"/>
           <w:szCs w:val="28"/>
@@ -3898,7 +3869,6 @@
       </w:pPr>
       <w:r>
         <w:rPr>
-          <w:b/>
           <w:bCs/>
           <w:sz w:val="36"/>
           <w:szCs w:val="36"/>
@@ -3917,7 +3887,6 @@
       </w:pPr>
       <w:r>
         <w:rPr>
-          <w:b/>
           <w:bCs/>
           <w:sz w:val="28"/>
           <w:szCs w:val="28"/>

</xml_diff>